<commit_message>
feat: improve document chunking and RAG regression reliability
</commit_message>
<xml_diff>
--- a/sample_docs/fictional_enterprise/06_开放平台API接入与故障处理技术手册.docx
+++ b/sample_docs/fictional_enterprise/06_开放平台API接入与故障处理技术手册.docx
@@ -23,20 +23,6 @@
           <w:sz w:val="24"/>
         </w:rPr>
         <w:t>启明数字科技有限公司</w:t>
-      </w:r>
-    </w:p>
-    <w:p>
-      <w:pPr>
-        <w:jc w:val="center"/>
-      </w:pPr>
-      <w:r>
-        <w:rPr>
-          <w:rFonts w:ascii="Microsoft YaHei" w:hAnsi="Microsoft YaHei" w:eastAsia="Microsoft YaHei"/>
-          <w:b w:val="0"/>
-          <w:color w:val="666666"/>
-          <w:sz w:val="20"/>
-        </w:rPr>
-        <w:t>企业 RAG 测试语料</w:t>
       </w:r>
     </w:p>
     <w:tbl>
@@ -494,26 +480,6 @@
       </w:tr>
     </w:tbl>
     <w:p/>
-    <w:p>
-      <w:r>
-        <w:rPr>
-          <w:rFonts w:ascii="Microsoft YaHei" w:hAnsi="Microsoft YaHei" w:eastAsia="Microsoft YaHei"/>
-          <w:b/>
-          <w:color w:val="000000"/>
-          <w:sz w:val="21"/>
-        </w:rPr>
-        <w:t>文件说明：</w:t>
-      </w:r>
-      <w:r>
-        <w:rPr>
-          <w:rFonts w:ascii="Microsoft YaHei" w:hAnsi="Microsoft YaHei" w:eastAsia="Microsoft YaHei"/>
-          <w:b w:val="0"/>
-          <w:color w:val="000000"/>
-          <w:sz w:val="21"/>
-        </w:rPr>
-        <w:t>模拟企业文件，仅用于检索增强生成系统的开发、测试与评估，不具有实际管理或法律效力。</w:t>
-      </w:r>
-    </w:p>
     <w:p>
       <w:pPr>
         <w:jc w:val="both"/>

</xml_diff>